<commit_message>
Record confirmed staff testing and manual accuracy
</commit_message>
<xml_diff>
--- a/AICA_L2_Capstone_VinodDandwani/3_Examples_and_Support/Test_Results.docx
+++ b/AICA_L2_Capstone_VinodDandwani/3_Examples_and_Support/Test_Results.docx
@@ -1219,12 +1219,7 @@
         <w:spacing w:after="100" w:line="280"/>
       </w:pPr>
       <w:r>
-        <w:rPr>
-          <w:rFonts w:ascii="Arial" w:cs="Arial" w:eastAsia="Arial" w:hAnsi="Arial"/>
-          <w:sz w:val="20"/>
-          <w:szCs w:val="20"/>
-        </w:rPr>
-        <w:t xml:space="preserve">Pilot results from staff testing on anonymised statements are recorded in Section 12.2 of the Project Summary.</w:t>
+        <w:t>Staff tested CSV, Excel and PDF uploads and approved the tool as working satisfactorily. CA Vinod H Dandwani confirmed this on 20 October 2026. He also confirmed that two files were manually checked with 100% accuracy for the checked results. Bank names, file identifiers and an agency comparison are not recorded; no broader accuracy claim is made. See Section 12.2 of the Project Summary.</w:t>
       </w:r>
     </w:p>
     <w:sectPr>

</xml_diff>